<commit_message>
Bring the objective and requirements document up to date
Adds O8 (interactive demo) and O9 (next-session forecast) to the objectives, a
Stage 6 to the architecture covering both, FR16-FR18, AC9-AC11, yfinance to the
software list, and records the LIME seeding defect and its fix against NFR1.

Co-Authored-By: Claude Opus 5 <noreply@anthropic.com>
</commit_message>
<xml_diff>
--- a/OBJECTIVE_MODEL_REQUIREMENTS.docx
+++ b/OBJECTIVE_MODEL_REQUIREMENTS.docx
@@ -1025,6 +1025,212 @@
           </w:p>
         </w:tc>
       </w:tr>
+      <w:tr>
+        <w:tc>
+          <w:tcPr>
+            <w:tcW w:type="dxa" w:w="787"/>
+          </w:tcPr>
+          <w:p>
+            <w:pPr>
+              <w:pStyle w:val="Compact"/>
+              <w:spacing w:after="40"/>
+              <w:jc w:val="left"/>
+            </w:pPr>
+            <w:r>
+              <w:rPr>
+                <w:bCs/>
+                <w:rFonts w:ascii="Calibri" w:hAnsi="Calibri"/>
+                <w:b/>
+                <w:sz w:val="18"/>
+              </w:rPr>
+              <w:t xml:space="preserve">O8</w:t>
+            </w:r>
+          </w:p>
+        </w:tc>
+        <w:tc>
+          <w:tcPr>
+            <w:tcW w:type="dxa" w:w="2950"/>
+          </w:tcPr>
+          <w:p>
+            <w:pPr>
+              <w:pStyle w:val="Compact"/>
+              <w:spacing w:after="40"/>
+              <w:jc w:val="left"/>
+            </w:pPr>
+            <w:r>
+              <w:rPr>
+                <w:rFonts w:ascii="Calibri" w:hAnsi="Calibri"/>
+                <w:sz w:val="18"/>
+              </w:rPr>
+              <w:t xml:space="preserve">Make the audit inspectable one forecast at a time</w:t>
+            </w:r>
+          </w:p>
+        </w:tc>
+        <w:tc>
+          <w:tcPr>
+            <w:tcW w:type="dxa" w:w="2950"/>
+          </w:tcPr>
+          <w:p>
+            <w:pPr>
+              <w:pStyle w:val="Compact"/>
+              <w:spacing w:after="40"/>
+              <w:jc w:val="left"/>
+            </w:pPr>
+            <w:r>
+              <w:rPr>
+                <w:rFonts w:ascii="Calibri" w:hAnsi="Calibri"/>
+                <w:sz w:val="18"/>
+              </w:rPr>
+              <w:t xml:space="preserve">A local page that takes a stock and a day, runs the model, TreeSHAP and five LIME re-runs live, and reports agreement, stability and faithfulness for that single forecast</w:t>
+            </w:r>
+          </w:p>
+        </w:tc>
+        <w:tc>
+          <w:tcPr>
+            <w:tcW w:type="dxa" w:w="2950"/>
+          </w:tcPr>
+          <w:p>
+            <w:pPr>
+              <w:pStyle w:val="Compact"/>
+              <w:spacing w:after="40"/>
+              <w:jc w:val="left"/>
+            </w:pPr>
+            <w:r>
+              <w:rPr>
+                <w:rStyle w:val="VerbatimChar"/>
+                <w:rFonts w:ascii="Calibri" w:hAnsi="Calibri"/>
+                <w:sz w:val="18"/>
+              </w:rPr>
+              <w:t xml:space="preserve">src/app.py</w:t>
+            </w:r>
+            <w:r>
+              <w:rPr>
+                <w:rFonts w:ascii="Calibri" w:hAnsi="Calibri"/>
+                <w:sz w:val="18"/>
+              </w:rPr>
+              <w:t xml:space="preserve">,</w:t>
+            </w:r>
+            <w:r>
+              <w:rPr>
+                <w:rFonts w:ascii="Calibri" w:hAnsi="Calibri"/>
+                <w:sz w:val="18"/>
+              </w:rPr>
+              <w:t xml:space="preserve"> </w:t>
+            </w:r>
+            <w:r>
+              <w:rPr>
+                <w:rStyle w:val="VerbatimChar"/>
+                <w:rFonts w:ascii="Calibri" w:hAnsi="Calibri"/>
+                <w:sz w:val="18"/>
+              </w:rPr>
+              <w:t xml:space="preserve">src/static/index.html</w:t>
+            </w:r>
+          </w:p>
+        </w:tc>
+      </w:tr>
+      <w:tr>
+        <w:tc>
+          <w:tcPr>
+            <w:tcW w:type="dxa" w:w="787"/>
+          </w:tcPr>
+          <w:p>
+            <w:pPr>
+              <w:pStyle w:val="Compact"/>
+              <w:spacing w:after="40"/>
+              <w:jc w:val="left"/>
+            </w:pPr>
+            <w:r>
+              <w:rPr>
+                <w:bCs/>
+                <w:rFonts w:ascii="Calibri" w:hAnsi="Calibri"/>
+                <w:b/>
+                <w:sz w:val="18"/>
+              </w:rPr>
+              <w:t xml:space="preserve">O9</w:t>
+            </w:r>
+          </w:p>
+        </w:tc>
+        <w:tc>
+          <w:tcPr>
+            <w:tcW w:type="dxa" w:w="2950"/>
+          </w:tcPr>
+          <w:p>
+            <w:pPr>
+              <w:pStyle w:val="Compact"/>
+              <w:spacing w:after="40"/>
+              <w:jc w:val="left"/>
+            </w:pPr>
+            <w:r>
+              <w:rPr>
+                <w:rFonts w:ascii="Calibri" w:hAnsi="Calibri"/>
+                <w:sz w:val="18"/>
+              </w:rPr>
+              <w:t xml:space="preserve">Forecast a session whose outcome does not exist yet</w:t>
+            </w:r>
+          </w:p>
+        </w:tc>
+        <w:tc>
+          <w:tcPr>
+            <w:tcW w:type="dxa" w:w="2950"/>
+          </w:tcPr>
+          <w:p>
+            <w:pPr>
+              <w:pStyle w:val="Compact"/>
+              <w:spacing w:after="40"/>
+              <w:jc w:val="left"/>
+            </w:pPr>
+            <w:r>
+              <w:rPr>
+                <w:rFonts w:ascii="Calibri" w:hAnsi="Calibri"/>
+                <w:sz w:val="18"/>
+              </w:rPr>
+              <w:t xml:space="preserve">Download the universe from Yahoo Finance, rebuild the same features, retrain on everything up to the latest close, forecast the next session</w:t>
+            </w:r>
+          </w:p>
+        </w:tc>
+        <w:tc>
+          <w:tcPr>
+            <w:tcW w:type="dxa" w:w="2950"/>
+          </w:tcPr>
+          <w:p>
+            <w:pPr>
+              <w:pStyle w:val="Compact"/>
+              <w:spacing w:after="40"/>
+              <w:jc w:val="left"/>
+            </w:pPr>
+            <w:r>
+              <w:rPr>
+                <w:rStyle w:val="VerbatimChar"/>
+                <w:rFonts w:ascii="Calibri" w:hAnsi="Calibri"/>
+                <w:sz w:val="18"/>
+              </w:rPr>
+              <w:t xml:space="preserve">src/live.py</w:t>
+            </w:r>
+            <w:r>
+              <w:rPr>
+                <w:rFonts w:ascii="Calibri" w:hAnsi="Calibri"/>
+                <w:sz w:val="18"/>
+              </w:rPr>
+              <w:t xml:space="preserve">,</w:t>
+            </w:r>
+            <w:r>
+              <w:rPr>
+                <w:rFonts w:ascii="Calibri" w:hAnsi="Calibri"/>
+                <w:sz w:val="18"/>
+              </w:rPr>
+              <w:t xml:space="preserve"> </w:t>
+            </w:r>
+            <w:r>
+              <w:rPr>
+                <w:rStyle w:val="VerbatimChar"/>
+                <w:rFonts w:ascii="Calibri" w:hAnsi="Calibri"/>
+                <w:sz w:val="18"/>
+              </w:rPr>
+              <w:t xml:space="preserve">results/live_forecast.pkl</w:t>
+            </w:r>
+          </w:p>
+        </w:tc>
+      </w:tr>
     </w:tbl>
     <w:bookmarkEnd w:id="21"/>
     <w:bookmarkStart w:id="22" w:name="why-returns-and-not-raw-prices"/>
@@ -2044,7 +2250,160 @@
         <w:rPr>
           <w:rStyle w:val="VerbatimChar"/>
         </w:rPr>
-        <w:t xml:space="preserve">                              └──────────────────────────────────────────────────┘</w:t>
+        <w:t xml:space="preserve">                              └──────────────────────────┬───────────────────────┘</w:t>
+      </w:r>
+      <w:r>
+        <w:br/>
+      </w:r>
+      <w:r>
+        <w:rPr>
+          <w:rStyle w:val="VerbatimChar"/>
+        </w:rPr>
+        <w:t xml:space="preserve">                                                         ▼</w:t>
+      </w:r>
+      <w:r>
+        <w:br/>
+      </w:r>
+      <w:r>
+        <w:rPr>
+          <w:rStyle w:val="VerbatimChar"/>
+        </w:rPr>
+        <w:t xml:space="preserve">       ┌─────────────────────────────────────────────────────────────────────────┐</w:t>
+      </w:r>
+      <w:r>
+        <w:br/>
+      </w:r>
+      <w:r>
+        <w:rPr>
+          <w:rStyle w:val="VerbatimChar"/>
+        </w:rPr>
+        <w:t xml:space="preserve">       │  STAGE 6 — USE                                                          │</w:t>
+      </w:r>
+      <w:r>
+        <w:br/>
+      </w:r>
+      <w:r>
+        <w:rPr>
+          <w:rStyle w:val="VerbatimChar"/>
+        </w:rPr>
+        <w:t xml:space="preserve">       │                                                                         │</w:t>
+      </w:r>
+      <w:r>
+        <w:br/>
+      </w:r>
+      <w:r>
+        <w:rPr>
+          <w:rStyle w:val="VerbatimChar"/>
+        </w:rPr>
+        <w:t xml:space="preserve">       │  src/app.py     one stock + one day  ──►  forecast, TreeSHAP, 5 LIME    │</w:t>
+      </w:r>
+      <w:r>
+        <w:br/>
+      </w:r>
+      <w:r>
+        <w:rPr>
+          <w:rStyle w:val="VerbatimChar"/>
+        </w:rPr>
+        <w:t xml:space="preserve">       │                 runs, agreement, stability, faithfulness   (~0.7 s)     │</w:t>
+      </w:r>
+      <w:r>
+        <w:br/>
+      </w:r>
+      <w:r>
+        <w:rPr>
+          <w:rStyle w:val="VerbatimChar"/>
+        </w:rPr>
+        <w:t xml:space="preserve">       │                 past day   → outcome known, forecast is scored          │</w:t>
+      </w:r>
+      <w:r>
+        <w:br/>
+      </w:r>
+      <w:r>
+        <w:rPr>
+          <w:rStyle w:val="VerbatimChar"/>
+        </w:rPr>
+        <w:t xml:space="preserve">       │                 next day   → outcome blank, nothing to score            │</w:t>
+      </w:r>
+      <w:r>
+        <w:br/>
+      </w:r>
+      <w:r>
+        <w:rPr>
+          <w:rStyle w:val="VerbatimChar"/>
+        </w:rPr>
+        <w:t xml:space="preserve">       │                                                                         │</w:t>
+      </w:r>
+      <w:r>
+        <w:br/>
+      </w:r>
+      <w:r>
+        <w:rPr>
+          <w:rStyle w:val="VerbatimChar"/>
+        </w:rPr>
+        <w:t xml:space="preserve">       │  src/live.py    Yahoo Finance ──► same 32 features ──► retrain on       │</w:t>
+      </w:r>
+      <w:r>
+        <w:br/>
+      </w:r>
+      <w:r>
+        <w:rPr>
+          <w:rStyle w:val="VerbatimChar"/>
+        </w:rPr>
+        <w:t xml:space="preserve">       │                 everything to the latest close ──► forecast the next    │</w:t>
+      </w:r>
+      <w:r>
+        <w:br/>
+      </w:r>
+      <w:r>
+        <w:rPr>
+          <w:rStyle w:val="VerbatimChar"/>
+        </w:rPr>
+        <w:t xml:space="preserve">       │                 session for the 431 tickers that still trade            │</w:t>
+      </w:r>
+      <w:r>
+        <w:br/>
+      </w:r>
+      <w:r>
+        <w:rPr>
+          <w:rStyle w:val="VerbatimChar"/>
+        </w:rPr>
+        <w:t xml:space="preserve">       └─────────────────────────────────────────────────────────────────────────┘</w:t>
+      </w:r>
+    </w:p>
+    <w:p>
+      <w:pPr>
+        <w:pStyle w:val="FirstParagraph"/>
+      </w:pPr>
+      <w:r>
+        <w:rPr>
+          <w:bCs/>
+          <w:b/>
+        </w:rPr>
+        <w:t xml:space="preserve">The two halves of Stage 6 answer different questions.</w:t>
+      </w:r>
+      <w:r>
+        <w:t xml:space="preserve"> </w:t>
+      </w:r>
+      <w:r>
+        <w:t xml:space="preserve">A forecast of a past day can be</w:t>
+      </w:r>
+      <w:r>
+        <w:t xml:space="preserve"> </w:t>
+      </w:r>
+      <w:r>
+        <w:t xml:space="preserve">graded, which is how accuracy is measured at all; a forecast of the next session cannot be</w:t>
+      </w:r>
+      <w:r>
+        <w:t xml:space="preserve"> </w:t>
+      </w:r>
+      <w:r>
+        <w:t xml:space="preserve">graded yet, which is what a deployed model actually does. The same model, features and</w:t>
+      </w:r>
+      <w:r>
+        <w:t xml:space="preserve"> </w:t>
+      </w:r>
+      <w:r>
+        <w:t xml:space="preserve">explainers serve both.</w:t>
       </w:r>
     </w:p>
     <w:bookmarkEnd w:id="24"/>
@@ -5142,6 +5501,126 @@
           </w:p>
         </w:tc>
       </w:tr>
+      <w:tr>
+        <w:tc>
+          <w:tcPr>
+            <w:tcW w:type="dxa" w:w="2029"/>
+          </w:tcPr>
+          <w:p>
+            <w:pPr>
+              <w:pStyle w:val="Compact"/>
+              <w:spacing w:after="40"/>
+              <w:jc w:val="left"/>
+            </w:pPr>
+            <w:r>
+              <w:rPr>
+                <w:rFonts w:ascii="Calibri" w:hAnsi="Calibri"/>
+                <w:sz w:val="18"/>
+              </w:rPr>
+              <w:t xml:space="preserve">FR16</w:t>
+            </w:r>
+          </w:p>
+        </w:tc>
+        <w:tc>
+          <w:tcPr>
+            <w:tcW w:type="dxa" w:w="7609"/>
+          </w:tcPr>
+          <w:p>
+            <w:pPr>
+              <w:pStyle w:val="Compact"/>
+              <w:spacing w:after="40"/>
+              <w:jc w:val="left"/>
+            </w:pPr>
+            <w:r>
+              <w:rPr>
+                <w:rFonts w:ascii="Calibri" w:hAnsi="Calibri"/>
+                <w:sz w:val="18"/>
+              </w:rPr>
+              <w:t xml:space="preserve">The system shall provide an interactive page that accepts a stock and a trading day and returns, computed live from the saved model, the forecast, its TreeSHAP and LIME explanations, their agreement, LIME’s run-to-run stability over 5 re-runs, and a faithfulness test for that single forecast.</w:t>
+            </w:r>
+          </w:p>
+        </w:tc>
+      </w:tr>
+      <w:tr>
+        <w:tc>
+          <w:tcPr>
+            <w:tcW w:type="dxa" w:w="2029"/>
+          </w:tcPr>
+          <w:p>
+            <w:pPr>
+              <w:pStyle w:val="Compact"/>
+              <w:spacing w:after="40"/>
+              <w:jc w:val="left"/>
+            </w:pPr>
+            <w:r>
+              <w:rPr>
+                <w:rFonts w:ascii="Calibri" w:hAnsi="Calibri"/>
+                <w:sz w:val="18"/>
+              </w:rPr>
+              <w:t xml:space="preserve">FR17</w:t>
+            </w:r>
+          </w:p>
+        </w:tc>
+        <w:tc>
+          <w:tcPr>
+            <w:tcW w:type="dxa" w:w="7609"/>
+          </w:tcPr>
+          <w:p>
+            <w:pPr>
+              <w:pStyle w:val="Compact"/>
+              <w:spacing w:after="40"/>
+              <w:jc w:val="left"/>
+            </w:pPr>
+            <w:r>
+              <w:rPr>
+                <w:rFonts w:ascii="Calibri" w:hAnsi="Calibri"/>
+                <w:sz w:val="18"/>
+              </w:rPr>
+              <w:t xml:space="preserve">The system shall additionally forecast the next trading session: retrieving current prices, rebuilding the same features, retraining with the same hyperparameters up to the latest close, and presenting the result with its outcome fields explicitly blank.</w:t>
+            </w:r>
+          </w:p>
+        </w:tc>
+      </w:tr>
+      <w:tr>
+        <w:tc>
+          <w:tcPr>
+            <w:tcW w:type="dxa" w:w="2029"/>
+          </w:tcPr>
+          <w:p>
+            <w:pPr>
+              <w:pStyle w:val="Compact"/>
+              <w:spacing w:after="40"/>
+              <w:jc w:val="left"/>
+            </w:pPr>
+            <w:r>
+              <w:rPr>
+                <w:rFonts w:ascii="Calibri" w:hAnsi="Calibri"/>
+                <w:sz w:val="18"/>
+              </w:rPr>
+              <w:t xml:space="preserve">FR18</w:t>
+            </w:r>
+          </w:p>
+        </w:tc>
+        <w:tc>
+          <w:tcPr>
+            <w:tcW w:type="dxa" w:w="7609"/>
+          </w:tcPr>
+          <w:p>
+            <w:pPr>
+              <w:pStyle w:val="Compact"/>
+              <w:spacing w:after="40"/>
+              <w:jc w:val="left"/>
+            </w:pPr>
+            <w:r>
+              <w:rPr>
+                <w:rFonts w:ascii="Calibri" w:hAnsi="Calibri"/>
+                <w:sz w:val="18"/>
+              </w:rPr>
+              <w:t xml:space="preserve">The system shall state, wherever a live forecast is shown, how many of the original 474 tickers still trade, which price vendor was used, and that the backtest found no return skill.</w:t>
+            </w:r>
+          </w:p>
+        </w:tc>
+      </w:tr>
     </w:tbl>
     <w:bookmarkEnd w:id="31"/>
     <w:bookmarkStart w:id="32" w:name="non-functional-requirements"/>
@@ -5284,6 +5763,133 @@
                 <w:sz w:val="18"/>
               </w:rPr>
               <w:t xml:space="preserve">); a full re-run must reproduce every published number.</w:t>
+            </w:r>
+            <w:r>
+              <w:rPr>
+                <w:rFonts w:ascii="Calibri" w:hAnsi="Calibri"/>
+                <w:sz w:val="18"/>
+              </w:rPr>
+              <w:t xml:space="preserve"> </w:t>
+            </w:r>
+            <w:r>
+              <w:rPr>
+                <w:iCs/>
+                <w:rFonts w:ascii="Calibri" w:hAnsi="Calibri"/>
+                <w:i/>
+                <w:sz w:val="18"/>
+              </w:rPr>
+              <w:t xml:space="preserve">Defect found and fixed:</w:t>
+            </w:r>
+            <w:r>
+              <w:rPr>
+                <w:iCs/>
+                <w:rFonts w:ascii="Calibri" w:hAnsi="Calibri"/>
+                <w:i/>
+                <w:sz w:val="18"/>
+              </w:rPr>
+              <w:t xml:space="preserve"> </w:t>
+            </w:r>
+            <w:r>
+              <w:rPr>
+                <w:rStyle w:val="VerbatimChar"/>
+                <w:iCs/>
+                <w:rFonts w:ascii="Calibri" w:hAnsi="Calibri"/>
+                <w:i/>
+                <w:sz w:val="18"/>
+              </w:rPr>
+              <w:t xml:space="preserve">LimeTabularExplainer</w:t>
+            </w:r>
+            <w:r>
+              <w:rPr>
+                <w:iCs/>
+                <w:rFonts w:ascii="Calibri" w:hAnsi="Calibri"/>
+                <w:i/>
+                <w:sz w:val="18"/>
+              </w:rPr>
+              <w:t xml:space="preserve"> </w:t>
+            </w:r>
+            <w:r>
+              <w:rPr>
+                <w:iCs/>
+                <w:rFonts w:ascii="Calibri" w:hAnsi="Calibri"/>
+                <w:i/>
+                <w:sz w:val="18"/>
+              </w:rPr>
+              <w:t xml:space="preserve">binds its</w:t>
+            </w:r>
+            <w:r>
+              <w:rPr>
+                <w:iCs/>
+                <w:rFonts w:ascii="Calibri" w:hAnsi="Calibri"/>
+                <w:i/>
+                <w:sz w:val="18"/>
+              </w:rPr>
+              <w:t xml:space="preserve"> </w:t>
+            </w:r>
+            <w:r>
+              <w:rPr>
+                <w:rStyle w:val="VerbatimChar"/>
+                <w:iCs/>
+                <w:rFonts w:ascii="Calibri" w:hAnsi="Calibri"/>
+                <w:i/>
+                <w:sz w:val="18"/>
+              </w:rPr>
+              <w:t xml:space="preserve">RandomState</w:t>
+            </w:r>
+            <w:r>
+              <w:rPr>
+                <w:iCs/>
+                <w:rFonts w:ascii="Calibri" w:hAnsi="Calibri"/>
+                <w:i/>
+                <w:sz w:val="18"/>
+              </w:rPr>
+              <w:t xml:space="preserve"> </w:t>
+            </w:r>
+            <w:r>
+              <w:rPr>
+                <w:iCs/>
+                <w:rFonts w:ascii="Calibri" w:hAnsi="Calibri"/>
+                <w:i/>
+                <w:sz w:val="18"/>
+              </w:rPr>
+              <w:t xml:space="preserve">into the discretiser and the surrogate solver at construction, so reassigning</w:t>
+            </w:r>
+            <w:r>
+              <w:rPr>
+                <w:iCs/>
+                <w:rFonts w:ascii="Calibri" w:hAnsi="Calibri"/>
+                <w:i/>
+                <w:sz w:val="18"/>
+              </w:rPr>
+              <w:t xml:space="preserve"> </w:t>
+            </w:r>
+            <w:r>
+              <w:rPr>
+                <w:rStyle w:val="VerbatimChar"/>
+                <w:iCs/>
+                <w:rFonts w:ascii="Calibri" w:hAnsi="Calibri"/>
+                <w:i/>
+                <w:sz w:val="18"/>
+              </w:rPr>
+              <w:t xml:space="preserve">.random_state</w:t>
+            </w:r>
+            <w:r>
+              <w:rPr>
+                <w:iCs/>
+                <w:rFonts w:ascii="Calibri" w:hAnsi="Calibri"/>
+                <w:i/>
+                <w:sz w:val="18"/>
+              </w:rPr>
+              <w:t xml:space="preserve"> </w:t>
+            </w:r>
+            <w:r>
+              <w:rPr>
+                <w:iCs/>
+                <w:rFonts w:ascii="Calibri" w:hAnsi="Calibri"/>
+                <w:i/>
+                <w:sz w:val="18"/>
+              </w:rPr>
+              <w:t xml:space="preserve">on a reused explainer left the same seed returning a different explanation on every call (Spearman 0.46–0.53 between repeats that should have been identical). A fresh explainer is now constructed per seed, at a cost of 18 ms, and repeats are bit-identical.</w:t>
             </w:r>
           </w:p>
         </w:tc>
@@ -6372,6 +6978,65 @@
                 <w:rFonts w:ascii="Calibri" w:hAnsi="Calibri"/>
                 <w:sz w:val="18"/>
               </w:rPr>
+              <w:t xml:space="preserve">yfinance</w:t>
+            </w:r>
+          </w:p>
+        </w:tc>
+        <w:tc>
+          <w:tcPr>
+            <w:tcW w:type="dxa" w:w="1606"/>
+          </w:tcPr>
+          <w:p>
+            <w:pPr>
+              <w:pStyle w:val="Compact"/>
+              <w:spacing w:after="40"/>
+              <w:jc w:val="left"/>
+            </w:pPr>
+            <w:r>
+              <w:rPr>
+                <w:rFonts w:ascii="Calibri" w:hAnsi="Calibri"/>
+                <w:sz w:val="18"/>
+              </w:rPr>
+              <w:t xml:space="preserve">1.7.0</w:t>
+            </w:r>
+          </w:p>
+        </w:tc>
+        <w:tc>
+          <w:tcPr>
+            <w:tcW w:type="dxa" w:w="6024"/>
+          </w:tcPr>
+          <w:p>
+            <w:pPr>
+              <w:pStyle w:val="Compact"/>
+              <w:spacing w:after="40"/>
+              <w:jc w:val="left"/>
+            </w:pPr>
+            <w:r>
+              <w:rPr>
+                <w:rFonts w:ascii="Calibri" w:hAnsi="Calibri"/>
+                <w:sz w:val="18"/>
+              </w:rPr>
+              <w:t xml:space="preserve">current prices for the next-session forecast</w:t>
+            </w:r>
+          </w:p>
+        </w:tc>
+      </w:tr>
+      <w:tr>
+        <w:tc>
+          <w:tcPr>
+            <w:tcW w:type="dxa" w:w="2008"/>
+          </w:tcPr>
+          <w:p>
+            <w:pPr>
+              <w:pStyle w:val="Compact"/>
+              <w:spacing w:after="40"/>
+              <w:jc w:val="left"/>
+            </w:pPr>
+            <w:r>
+              <w:rPr>
+                <w:rFonts w:ascii="Calibri" w:hAnsi="Calibri"/>
+                <w:sz w:val="18"/>
+              </w:rPr>
               <w:t xml:space="preserve">Node.js + pptxgenjs</w:t>
             </w:r>
           </w:p>
@@ -7224,14 +7889,14 @@
         <w:tblLayout w:type="fixed"/>
       </w:tblPr>
       <w:tblGrid>
-        <w:gridCol w:w="1223"/>
-        <w:gridCol w:w="4589"/>
-        <w:gridCol w:w="3824"/>
+        <w:gridCol w:w="1133"/>
+        <w:gridCol w:w="4251"/>
+        <w:gridCol w:w="4251"/>
       </w:tblGrid>
       <w:tr>
         <w:tc>
           <w:tcPr>
-            <w:tcW w:type="dxa" w:w="1224"/>
+            <w:tcW w:type="dxa" w:w="1134"/>
             <w:shd w:val="clear" w:color="auto" w:fill="DCE6F1"/>
           </w:tcPr>
           <w:p>
@@ -7252,7 +7917,7 @@
         </w:tc>
         <w:tc>
           <w:tcPr>
-            <w:tcW w:type="dxa" w:w="4589"/>
+            <w:tcW w:type="dxa" w:w="4252"/>
             <w:shd w:val="clear" w:color="auto" w:fill="DCE6F1"/>
           </w:tcPr>
           <w:p>
@@ -7273,7 +7938,7 @@
         </w:tc>
         <w:tc>
           <w:tcPr>
-            <w:tcW w:type="dxa" w:w="3825"/>
+            <w:tcW w:type="dxa" w:w="4252"/>
             <w:shd w:val="clear" w:color="auto" w:fill="DCE6F1"/>
           </w:tcPr>
           <w:p>
@@ -7296,7 +7961,7 @@
       <w:tr>
         <w:tc>
           <w:tcPr>
-            <w:tcW w:type="dxa" w:w="1224"/>
+            <w:tcW w:type="dxa" w:w="1134"/>
           </w:tcPr>
           <w:p>
             <w:pPr>
@@ -7315,7 +7980,7 @@
         </w:tc>
         <w:tc>
           <w:tcPr>
-            <w:tcW w:type="dxa" w:w="4589"/>
+            <w:tcW w:type="dxa" w:w="4252"/>
           </w:tcPr>
           <w:p>
             <w:pPr>
@@ -7334,7 +7999,7 @@
         </w:tc>
         <w:tc>
           <w:tcPr>
-            <w:tcW w:type="dxa" w:w="3825"/>
+            <w:tcW w:type="dxa" w:w="4252"/>
           </w:tcPr>
           <w:p>
             <w:pPr>
@@ -7355,7 +8020,7 @@
       <w:tr>
         <w:tc>
           <w:tcPr>
-            <w:tcW w:type="dxa" w:w="1224"/>
+            <w:tcW w:type="dxa" w:w="1134"/>
           </w:tcPr>
           <w:p>
             <w:pPr>
@@ -7374,7 +8039,7 @@
         </w:tc>
         <w:tc>
           <w:tcPr>
-            <w:tcW w:type="dxa" w:w="4589"/>
+            <w:tcW w:type="dxa" w:w="4252"/>
           </w:tcPr>
           <w:p>
             <w:pPr>
@@ -7393,7 +8058,7 @@
         </w:tc>
         <w:tc>
           <w:tcPr>
-            <w:tcW w:type="dxa" w:w="3825"/>
+            <w:tcW w:type="dxa" w:w="4252"/>
           </w:tcPr>
           <w:p>
             <w:pPr>
@@ -7414,7 +8079,7 @@
       <w:tr>
         <w:tc>
           <w:tcPr>
-            <w:tcW w:type="dxa" w:w="1224"/>
+            <w:tcW w:type="dxa" w:w="1134"/>
           </w:tcPr>
           <w:p>
             <w:pPr>
@@ -7433,7 +8098,7 @@
         </w:tc>
         <w:tc>
           <w:tcPr>
-            <w:tcW w:type="dxa" w:w="4589"/>
+            <w:tcW w:type="dxa" w:w="4252"/>
           </w:tcPr>
           <w:p>
             <w:pPr>
@@ -7452,7 +8117,7 @@
         </w:tc>
         <w:tc>
           <w:tcPr>
-            <w:tcW w:type="dxa" w:w="3825"/>
+            <w:tcW w:type="dxa" w:w="4252"/>
           </w:tcPr>
           <w:p>
             <w:pPr>
@@ -7473,7 +8138,7 @@
       <w:tr>
         <w:tc>
           <w:tcPr>
-            <w:tcW w:type="dxa" w:w="1224"/>
+            <w:tcW w:type="dxa" w:w="1134"/>
           </w:tcPr>
           <w:p>
             <w:pPr>
@@ -7492,7 +8157,7 @@
         </w:tc>
         <w:tc>
           <w:tcPr>
-            <w:tcW w:type="dxa" w:w="4589"/>
+            <w:tcW w:type="dxa" w:w="4252"/>
           </w:tcPr>
           <w:p>
             <w:pPr>
@@ -7511,7 +8176,7 @@
         </w:tc>
         <w:tc>
           <w:tcPr>
-            <w:tcW w:type="dxa" w:w="3825"/>
+            <w:tcW w:type="dxa" w:w="4252"/>
           </w:tcPr>
           <w:p>
             <w:pPr>
@@ -7532,7 +8197,7 @@
       <w:tr>
         <w:tc>
           <w:tcPr>
-            <w:tcW w:type="dxa" w:w="1224"/>
+            <w:tcW w:type="dxa" w:w="1134"/>
           </w:tcPr>
           <w:p>
             <w:pPr>
@@ -7551,7 +8216,7 @@
         </w:tc>
         <w:tc>
           <w:tcPr>
-            <w:tcW w:type="dxa" w:w="4589"/>
+            <w:tcW w:type="dxa" w:w="4252"/>
           </w:tcPr>
           <w:p>
             <w:pPr>
@@ -7570,7 +8235,7 @@
         </w:tc>
         <w:tc>
           <w:tcPr>
-            <w:tcW w:type="dxa" w:w="3825"/>
+            <w:tcW w:type="dxa" w:w="4252"/>
           </w:tcPr>
           <w:p>
             <w:pPr>
@@ -7621,7 +8286,7 @@
       <w:tr>
         <w:tc>
           <w:tcPr>
-            <w:tcW w:type="dxa" w:w="1224"/>
+            <w:tcW w:type="dxa" w:w="1134"/>
           </w:tcPr>
           <w:p>
             <w:pPr>
@@ -7640,7 +8305,7 @@
         </w:tc>
         <w:tc>
           <w:tcPr>
-            <w:tcW w:type="dxa" w:w="4589"/>
+            <w:tcW w:type="dxa" w:w="4252"/>
           </w:tcPr>
           <w:p>
             <w:pPr>
@@ -7659,7 +8324,7 @@
         </w:tc>
         <w:tc>
           <w:tcPr>
-            <w:tcW w:type="dxa" w:w="3825"/>
+            <w:tcW w:type="dxa" w:w="4252"/>
           </w:tcPr>
           <w:p>
             <w:pPr>
@@ -7680,7 +8345,7 @@
       <w:tr>
         <w:tc>
           <w:tcPr>
-            <w:tcW w:type="dxa" w:w="1224"/>
+            <w:tcW w:type="dxa" w:w="1134"/>
           </w:tcPr>
           <w:p>
             <w:pPr>
@@ -7699,7 +8364,7 @@
         </w:tc>
         <w:tc>
           <w:tcPr>
-            <w:tcW w:type="dxa" w:w="4589"/>
+            <w:tcW w:type="dxa" w:w="4252"/>
           </w:tcPr>
           <w:p>
             <w:pPr>
@@ -7718,7 +8383,7 @@
         </w:tc>
         <w:tc>
           <w:tcPr>
-            <w:tcW w:type="dxa" w:w="3825"/>
+            <w:tcW w:type="dxa" w:w="4252"/>
           </w:tcPr>
           <w:p>
             <w:pPr>
@@ -7739,7 +8404,7 @@
       <w:tr>
         <w:tc>
           <w:tcPr>
-            <w:tcW w:type="dxa" w:w="1224"/>
+            <w:tcW w:type="dxa" w:w="1134"/>
           </w:tcPr>
           <w:p>
             <w:pPr>
@@ -7758,7 +8423,7 @@
         </w:tc>
         <w:tc>
           <w:tcPr>
-            <w:tcW w:type="dxa" w:w="4589"/>
+            <w:tcW w:type="dxa" w:w="4252"/>
           </w:tcPr>
           <w:p>
             <w:pPr>
@@ -7777,20 +8442,20 @@
         </w:tc>
         <w:tc>
           <w:tcPr>
-            <w:tcW w:type="dxa" w:w="3825"/>
-          </w:tcPr>
-          <w:p>
-            <w:pPr>
-              <w:pStyle w:val="Compact"/>
-              <w:spacing w:after="40"/>
-              <w:jc w:val="left"/>
-            </w:pPr>
-            <w:r>
-              <w:rPr>
-                <w:rFonts w:ascii="Calibri" w:hAnsi="Calibri"/>
-                <w:sz w:val="18"/>
-              </w:rPr>
-              <w:t xml:space="preserve">✅ 8 scripts, documented in</w:t>
+            <w:tcW w:type="dxa" w:w="4252"/>
+          </w:tcPr>
+          <w:p>
+            <w:pPr>
+              <w:pStyle w:val="Compact"/>
+              <w:spacing w:after="40"/>
+              <w:jc w:val="left"/>
+            </w:pPr>
+            <w:r>
+              <w:rPr>
+                <w:rFonts w:ascii="Calibri" w:hAnsi="Calibri"/>
+                <w:sz w:val="18"/>
+              </w:rPr>
+              <w:t xml:space="preserve">✅ 12 steps, documented in</w:t>
             </w:r>
             <w:r>
               <w:rPr>
@@ -7806,6 +8471,183 @@
                 <w:sz w:val="18"/>
               </w:rPr>
               <w:t xml:space="preserve">README.md</w:t>
+            </w:r>
+          </w:p>
+        </w:tc>
+      </w:tr>
+      <w:tr>
+        <w:tc>
+          <w:tcPr>
+            <w:tcW w:type="dxa" w:w="1134"/>
+          </w:tcPr>
+          <w:p>
+            <w:pPr>
+              <w:pStyle w:val="Compact"/>
+              <w:spacing w:after="40"/>
+              <w:jc w:val="left"/>
+            </w:pPr>
+            <w:r>
+              <w:rPr>
+                <w:rFonts w:ascii="Calibri" w:hAnsi="Calibri"/>
+                <w:sz w:val="18"/>
+              </w:rPr>
+              <w:t xml:space="preserve">AC9</w:t>
+            </w:r>
+          </w:p>
+        </w:tc>
+        <w:tc>
+          <w:tcPr>
+            <w:tcW w:type="dxa" w:w="4252"/>
+          </w:tcPr>
+          <w:p>
+            <w:pPr>
+              <w:pStyle w:val="Compact"/>
+              <w:spacing w:after="40"/>
+              <w:jc w:val="left"/>
+            </w:pPr>
+            <w:r>
+              <w:rPr>
+                <w:rFonts w:ascii="Calibri" w:hAnsi="Calibri"/>
+                <w:sz w:val="18"/>
+              </w:rPr>
+              <w:t xml:space="preserve">Repeating a LIME explanation with the same seed returns identical weights</w:t>
+            </w:r>
+          </w:p>
+        </w:tc>
+        <w:tc>
+          <w:tcPr>
+            <w:tcW w:type="dxa" w:w="4252"/>
+          </w:tcPr>
+          <w:p>
+            <w:pPr>
+              <w:pStyle w:val="Compact"/>
+              <w:spacing w:after="40"/>
+              <w:jc w:val="left"/>
+            </w:pPr>
+            <w:r>
+              <w:rPr>
+                <w:rFonts w:ascii="Calibri" w:hAnsi="Calibri"/>
+                <w:sz w:val="18"/>
+              </w:rPr>
+              <w:t xml:space="preserve">✅ after the NFR1 fix; previously ρ 0.46–0.53</w:t>
+            </w:r>
+          </w:p>
+        </w:tc>
+      </w:tr>
+      <w:tr>
+        <w:tc>
+          <w:tcPr>
+            <w:tcW w:type="dxa" w:w="1134"/>
+          </w:tcPr>
+          <w:p>
+            <w:pPr>
+              <w:pStyle w:val="Compact"/>
+              <w:spacing w:after="40"/>
+              <w:jc w:val="left"/>
+            </w:pPr>
+            <w:r>
+              <w:rPr>
+                <w:rFonts w:ascii="Calibri" w:hAnsi="Calibri"/>
+                <w:sz w:val="18"/>
+              </w:rPr>
+              <w:t xml:space="preserve">AC10</w:t>
+            </w:r>
+          </w:p>
+        </w:tc>
+        <w:tc>
+          <w:tcPr>
+            <w:tcW w:type="dxa" w:w="4252"/>
+          </w:tcPr>
+          <w:p>
+            <w:pPr>
+              <w:pStyle w:val="Compact"/>
+              <w:spacing w:after="40"/>
+              <w:jc w:val="left"/>
+            </w:pPr>
+            <w:r>
+              <w:rPr>
+                <w:rFonts w:ascii="Calibri" w:hAnsi="Calibri"/>
+                <w:sz w:val="18"/>
+              </w:rPr>
+              <w:t xml:space="preserve">A single forecast can be explained and audited interactively</w:t>
+            </w:r>
+          </w:p>
+        </w:tc>
+        <w:tc>
+          <w:tcPr>
+            <w:tcW w:type="dxa" w:w="4252"/>
+          </w:tcPr>
+          <w:p>
+            <w:pPr>
+              <w:pStyle w:val="Compact"/>
+              <w:spacing w:after="40"/>
+              <w:jc w:val="left"/>
+            </w:pPr>
+            <w:r>
+              <w:rPr>
+                <w:rFonts w:ascii="Calibri" w:hAnsi="Calibri"/>
+                <w:sz w:val="18"/>
+              </w:rPr>
+              <w:t xml:space="preserve">✅ ≈ 0.7 s per stock-day, nothing served from cache</w:t>
+            </w:r>
+          </w:p>
+        </w:tc>
+      </w:tr>
+      <w:tr>
+        <w:tc>
+          <w:tcPr>
+            <w:tcW w:type="dxa" w:w="1134"/>
+          </w:tcPr>
+          <w:p>
+            <w:pPr>
+              <w:pStyle w:val="Compact"/>
+              <w:spacing w:after="40"/>
+              <w:jc w:val="left"/>
+            </w:pPr>
+            <w:r>
+              <w:rPr>
+                <w:rFonts w:ascii="Calibri" w:hAnsi="Calibri"/>
+                <w:sz w:val="18"/>
+              </w:rPr>
+              <w:t xml:space="preserve">AC11</w:t>
+            </w:r>
+          </w:p>
+        </w:tc>
+        <w:tc>
+          <w:tcPr>
+            <w:tcW w:type="dxa" w:w="4252"/>
+          </w:tcPr>
+          <w:p>
+            <w:pPr>
+              <w:pStyle w:val="Compact"/>
+              <w:spacing w:after="40"/>
+              <w:jc w:val="left"/>
+            </w:pPr>
+            <w:r>
+              <w:rPr>
+                <w:rFonts w:ascii="Calibri" w:hAnsi="Calibri"/>
+                <w:sz w:val="18"/>
+              </w:rPr>
+              <w:t xml:space="preserve">A forecast exists for a session that has not traded</w:t>
+            </w:r>
+          </w:p>
+        </w:tc>
+        <w:tc>
+          <w:tcPr>
+            <w:tcW w:type="dxa" w:w="4252"/>
+          </w:tcPr>
+          <w:p>
+            <w:pPr>
+              <w:pStyle w:val="Compact"/>
+              <w:spacing w:after="40"/>
+              <w:jc w:val="left"/>
+            </w:pPr>
+            <w:r>
+              <w:rPr>
+                <w:rFonts w:ascii="Calibri" w:hAnsi="Calibri"/>
+                <w:sz w:val="18"/>
+              </w:rPr>
+              <w:t xml:space="preserve">✅ 431 stocks, retrained on 1,470,270 stock-days, outcome fields blank</w:t>
             </w:r>
           </w:p>
         </w:tc>

</xml_diff>